<commit_message>
Applique le modèle Word aux couleurs UCAO (titres bleus #2563EB) aux documents du mémoire
- Modèle de référence docs/ucao-reference.docx ; 4 documents régénérés avec ce style

Co-Authored-By: Claude Opus 4.8 <noreply@anthropic.com>
</commit_message>
<xml_diff>
--- a/docs/SIGE_UCAO_Annexes_Memoire.docx
+++ b/docs/SIGE_UCAO_Annexes_Memoire.docx
@@ -2933,7 +2933,7 @@
       <w:rFonts w:asciiTheme="majorHAnsi" w:cstheme="majorBidi" w:eastAsiaTheme="majorEastAsia" w:hAnsiTheme="majorHAnsi"/>
       <w:b/>
       <w:bCs/>
-      <w:color w:themeColor="accent1" w:themeShade="B5" w:val="345A8A"/>
+      <w:color w:themeColor="accent1" w:themeShade="B5" w:val="2563EB"/>
       <w:sz w:val="36"/>
       <w:szCs w:val="36"/>
     </w:rPr>
@@ -3013,7 +3013,7 @@
       <w:rFonts w:asciiTheme="majorHAnsi" w:cstheme="majorBidi" w:eastAsiaTheme="majorEastAsia" w:hAnsiTheme="majorHAnsi"/>
       <w:b/>
       <w:bCs/>
-      <w:color w:themeColor="accent1" w:val="4F81BD"/>
+      <w:color w:themeColor="accent1" w:val="2563EB"/>
       <w:sz w:val="32"/>
       <w:szCs w:val="32"/>
     </w:rPr>
@@ -3035,7 +3035,7 @@
       <w:rFonts w:asciiTheme="majorHAnsi" w:cstheme="majorBidi" w:eastAsiaTheme="majorEastAsia" w:hAnsiTheme="majorHAnsi"/>
       <w:b/>
       <w:bCs/>
-      <w:color w:themeColor="accent1" w:val="4F81BD"/>
+      <w:color w:themeColor="accent1" w:val="2563EB"/>
       <w:sz w:val="28"/>
       <w:szCs w:val="28"/>
     </w:rPr>
@@ -3057,7 +3057,7 @@
       <w:rFonts w:asciiTheme="majorHAnsi" w:cstheme="majorBidi" w:eastAsiaTheme="majorEastAsia" w:hAnsiTheme="majorHAnsi"/>
       <w:b/>
       <w:bCs/>
-      <w:color w:themeColor="accent1" w:val="4F81BD"/>
+      <w:color w:themeColor="accent1" w:val="2563EB"/>
       <w:sz w:val="24"/>
       <w:szCs w:val="24"/>
     </w:rPr>
@@ -3079,7 +3079,7 @@
       <w:rFonts w:asciiTheme="majorHAnsi" w:cstheme="majorBidi" w:eastAsiaTheme="majorEastAsia" w:hAnsiTheme="majorHAnsi"/>
       <w:i/>
       <w:bCs/>
-      <w:color w:themeColor="accent1" w:val="4F81BD"/>
+      <w:color w:themeColor="accent1" w:val="2563EB"/>
       <w:sz w:val="24"/>
       <w:szCs w:val="24"/>
     </w:rPr>
@@ -3100,7 +3100,7 @@
     <w:rPr>
       <w:rFonts w:asciiTheme="majorHAnsi" w:cstheme="majorBidi" w:eastAsiaTheme="majorEastAsia" w:hAnsiTheme="majorHAnsi"/>
       <w:iCs/>
-      <w:color w:themeColor="accent1" w:val="4F81BD"/>
+      <w:color w:themeColor="accent1" w:val="2563EB"/>
       <w:sz w:val="24"/>
       <w:szCs w:val="24"/>
     </w:rPr>
@@ -3120,7 +3120,7 @@
     </w:pPr>
     <w:rPr>
       <w:rFonts w:asciiTheme="majorHAnsi" w:cstheme="majorBidi" w:eastAsiaTheme="majorEastAsia" w:hAnsiTheme="majorHAnsi"/>
-      <w:color w:themeColor="accent1" w:val="4F81BD"/>
+      <w:color w:themeColor="accent1" w:val="2563EB"/>
       <w:sz w:val="24"/>
       <w:szCs w:val="24"/>
     </w:rPr>
@@ -3140,7 +3140,7 @@
     </w:pPr>
     <w:rPr>
       <w:rFonts w:asciiTheme="majorHAnsi" w:cstheme="majorBidi" w:eastAsiaTheme="majorEastAsia" w:hAnsiTheme="majorHAnsi"/>
-      <w:color w:themeColor="accent1" w:val="4F81BD"/>
+      <w:color w:themeColor="accent1" w:val="2563EB"/>
       <w:sz w:val="24"/>
       <w:szCs w:val="24"/>
     </w:rPr>
@@ -3160,7 +3160,7 @@
     </w:pPr>
     <w:rPr>
       <w:rFonts w:asciiTheme="majorHAnsi" w:cstheme="majorBidi" w:eastAsiaTheme="majorEastAsia" w:hAnsiTheme="majorHAnsi"/>
-      <w:color w:themeColor="accent1" w:val="4F81BD"/>
+      <w:color w:themeColor="accent1" w:val="2563EB"/>
       <w:sz w:val="24"/>
       <w:szCs w:val="24"/>
     </w:rPr>
@@ -3180,7 +3180,7 @@
     </w:pPr>
     <w:rPr>
       <w:rFonts w:asciiTheme="majorHAnsi" w:cstheme="majorBidi" w:eastAsiaTheme="majorEastAsia" w:hAnsiTheme="majorHAnsi"/>
-      <w:color w:themeColor="accent1" w:val="4F81BD"/>
+      <w:color w:themeColor="accent1" w:val="2563EB"/>
       <w:sz w:val="24"/>
       <w:szCs w:val="24"/>
     </w:rPr>
@@ -3319,7 +3319,7 @@
     <w:name w:val="Hyperlink"/>
     <w:basedOn w:val="BodyTextChar"/>
     <w:rPr>
-      <w:color w:themeColor="accent1" w:val="4F81BD"/>
+      <w:color w:themeColor="accent1" w:val="2563EB"/>
     </w:rPr>
   </w:style>
   <w:style w:styleId="TOCHeading" w:type="paragraph">
@@ -3337,7 +3337,7 @@
       <w:rFonts w:asciiTheme="majorHAnsi" w:cstheme="majorBidi" w:eastAsiaTheme="majorEastAsia" w:hAnsiTheme="majorHAnsi"/>
       <w:b w:val="0"/>
       <w:bCs w:val="0"/>
-      <w:color w:themeColor="accent1" w:themeShade="BF" w:val="365F91"/>
+      <w:color w:themeColor="accent1" w:themeShade="BF" w:val="1D4ED8"/>
     </w:rPr>
   </w:style>
   <w:style w:type="paragraph" w:customStyle="1" w:styleId="SourceCode">

</xml_diff>

<commit_message>
Reproduit la mise en page du mémoire dans les docx (Times New Roman, justifié, en-tête titre + pied de page auteurs/pagination, A4)
- Modèle ucao-reference.docx enrichi : police Times via thème, interligne 1.5, en-tête et pied de page, marges A4 ; titres en bleu UCAO conservés
- 4 documents régénérés avec ce modèle

Co-Authored-By: Claude Opus 4.8 <noreply@anthropic.com>
</commit_message>
<xml_diff>
--- a/docs/SIGE_UCAO_Annexes_Memoire.docx
+++ b/docs/SIGE_UCAO_Annexes_Memoire.docx
@@ -2564,7 +2564,12 @@
       </w:r>
     </w:p>
     <w:bookmarkEnd w:id="25"/>
-    <w:sectPr/>
+    <w:sectPr>
+      <w:headerReference r:id="rId9" w:type="default"/>
+      <w:footerReference r:id="rId10" w:type="default"/>
+      <w:pgSz w:h="16838" w:w="11906"/>
+      <w:pgMar w:bottom="1417" w:footer="708" w:gutter="0" w:header="708" w:left="1417" w:right="1417" w:top="1417"/>
+    </w:sectPr>
   </w:body>
 </w:document>
 </file>
@@ -2573,6 +2578,36 @@
 <w:comments xmlns:w="http://schemas.openxmlformats.org/wordprocessingml/2006/main" xmlns:m="http://schemas.openxmlformats.org/officeDocument/2006/math" xmlns:r="http://schemas.openxmlformats.org/officeDocument/2006/relationships" xmlns:o="urn:schemas-microsoft-com:office:office" xmlns:v="urn:schemas-microsoft-com:vml" xmlns:w10="urn:schemas-microsoft-com:office:word" xmlns:a="http://schemas.openxmlformats.org/drawingml/2006/main" xmlns:pic="http://schemas.openxmlformats.org/drawingml/2006/picture" xmlns:wp="http://schemas.openxmlformats.org/drawingml/2006/wordprocessingDrawing"/>
 </file>
 
+<file path=word/footer1.xml><?xml version="1.0" encoding="utf-8"?>
+<w:ftr xmlns:w="http://schemas.openxmlformats.org/wordprocessingml/2006/main" xmlns:r="http://schemas.openxmlformats.org/officeDocument/2006/relationships">
+  <w:p>
+    <w:pPr>
+      <w:jc w:val="center"/>
+      <w:rPr>
+        <w:sz w:val="16"/>
+        <w:color w:val="666666"/>
+      </w:rPr>
+    </w:pPr>
+    <w:r>
+      <w:rPr>
+        <w:sz w:val="16"/>
+        <w:color w:val="666666"/>
+      </w:rPr>
+      <w:t xml:space="preserve">Becaye Sane &amp; Nahoume Diouf — Page </w:t>
+    </w:r>
+    <w:r>
+      <w:fldChar w:fldCharType="begin"/>
+    </w:r>
+    <w:r>
+      <w:instrText xml:space="preserve"> PAGE </w:instrText>
+    </w:r>
+    <w:r>
+      <w:fldChar w:fldCharType="end"/>
+    </w:r>
+  </w:p>
+</w:ftr>
+</file>
+
 <file path=word/footnotes.xml><?xml version="1.0" encoding="utf-8"?>
 <w:footnotes xmlns:w="http://schemas.openxmlformats.org/wordprocessingml/2006/main" xmlns:m="http://schemas.openxmlformats.org/officeDocument/2006/math" xmlns:r="http://schemas.openxmlformats.org/officeDocument/2006/relationships" xmlns:o="urn:schemas-microsoft-com:office:office" xmlns:v="urn:schemas-microsoft-com:vml" xmlns:w10="urn:schemas-microsoft-com:office:word" xmlns:a="http://schemas.openxmlformats.org/drawingml/2006/main" xmlns:pic="http://schemas.openxmlformats.org/drawingml/2006/picture" xmlns:wp="http://schemas.openxmlformats.org/drawingml/2006/wordprocessingDrawing">
   <w:footnote w:type="continuationSeparator" w:id="0">
@@ -2590,6 +2625,29 @@
     </w:p>
   </w:footnote>
 </w:footnotes>
+</file>
+
+<file path=word/header1.xml><?xml version="1.0" encoding="utf-8"?>
+<w:hdr xmlns:w="http://schemas.openxmlformats.org/wordprocessingml/2006/main">
+  <w:p>
+    <w:pPr>
+      <w:jc w:val="center"/>
+      <w:rPr>
+        <w:i/>
+        <w:sz w:val="16"/>
+        <w:color w:val="666666"/>
+      </w:rPr>
+    </w:pPr>
+    <w:r>
+      <w:rPr>
+        <w:i/>
+        <w:sz w:val="16"/>
+        <w:color w:val="666666"/>
+      </w:rPr>
+      <w:t>L'e-gouvernance et la digitalisation des services administratifs — UCAO Saint Michel</w:t>
+    </w:r>
+  </w:p>
+</w:hdr>
 </file>
 
 <file path=word/numbering.xml><?xml version="1.0" encoding="utf-8"?>
@@ -2886,7 +2944,8 @@
     </w:rPrDefault>
     <w:pPrDefault>
       <w:pPr>
-        <w:spacing w:after="200"/>
+        <w:spacing w:after="160" w:line="360" w:lineRule="auto"/>
+        <w:jc w:val="both"/>
       </w:pPr>
     </w:pPrDefault>
   </w:docDefaults>
@@ -3615,7 +3674,7 @@
     </a:clrScheme>
     <a:fontScheme name="Office">
       <a:majorFont>
-        <a:latin typeface="Calibri"/>
+        <a:latin typeface="Times New Roman"/>
         <a:ea typeface=""/>
         <a:cs typeface=""/>
         <a:font script="Jpan" typeface="ＭＳ ゴシック"/>
@@ -3649,7 +3708,7 @@
         <a:font script="Uigh" typeface="Microsoft Uighur"/>
       </a:majorFont>
       <a:minorFont>
-        <a:latin typeface="Cambria"/>
+        <a:latin typeface="Times New Roman"/>
         <a:ea typeface=""/>
         <a:cs typeface=""/>
         <a:font script="Jpan" typeface="ＭＳ 明朝"/>

</xml_diff>